<commit_message>
Property research: 3516 Winding Shore Lane - added Google Maps photo to report
- Added property location photo at top of DOCX and PDF reports
- Photo from Google Maps showing property location
- Files updated in Drive folder

Google Drive: https://drive.google.com/drive/folders/1yRRw2vG1pj5FPsVwgfS_S2YAqvpJkDuE
</commit_message>
<xml_diff>
--- a/3516_Winding_Shore_Lane_Property_Report.docx
+++ b/3516_Winding_Shore_Lane_Property_Report.docx
@@ -18,6 +18,51 @@
         <w:t>3516 Winding Shore Lane, Pflugerville TX 78660</w:t>
       </w:r>
     </w:p>
+    <w:p>
+      <w:pPr>
+        <w:pStyle w:val="Heading3"/>
+      </w:pPr>
+      <w:r>
+        <w:t>Google Maps Location:</w:t>
+      </w:r>
+    </w:p>
+    <w:p>
+      <w:r>
+        <w:drawing>
+          <wp:inline xmlns:a="http://schemas.openxmlformats.org/drawingml/2006/main" xmlns:pic="http://schemas.openxmlformats.org/drawingml/2006/picture">
+            <wp:extent cx="5486400" cy="3657600"/>
+            <wp:docPr id="1" name="Picture 1"/>
+            <wp:cNvGraphicFramePr>
+              <a:graphicFrameLocks noChangeAspect="1"/>
+            </wp:cNvGraphicFramePr>
+            <a:graphic>
+              <a:graphicData uri="http://schemas.openxmlformats.org/drawingml/2006/picture">
+                <pic:pic>
+                  <pic:nvPicPr>
+                    <pic:cNvPr id="0" name="3516_google_maps.jpg"/>
+                    <pic:cNvPicPr/>
+                  </pic:nvPicPr>
+                  <pic:blipFill>
+                    <a:blip r:embed="rId9"/>
+                    <a:stretch>
+                      <a:fillRect/>
+                    </a:stretch>
+                  </pic:blipFill>
+                  <pic:spPr>
+                    <a:xfrm>
+                      <a:off x="0" y="0"/>
+                      <a:ext cx="5486400" cy="3657600"/>
+                    </a:xfrm>
+                    <a:prstGeom prst="rect"/>
+                  </pic:spPr>
+                </pic:pic>
+              </a:graphicData>
+            </a:graphic>
+          </wp:inline>
+        </w:drawing>
+      </w:r>
+    </w:p>
+    <w:p/>
     <w:p/>
     <w:p>
       <w:pPr>
@@ -2101,7 +2146,7 @@
       <w:b/>
       <w:bCs/>
       <w:color w:val="365F91" w:themeColor="accent1" w:themeShade="BF"/>
-      <w:sz w:val="32"/>
+      <w:sz w:val="28"/>
       <w:szCs w:val="28"/>
     </w:rPr>
   </w:style>
@@ -2125,7 +2170,7 @@
       <w:b/>
       <w:bCs/>
       <w:color w:val="4F81BD" w:themeColor="accent1"/>
-      <w:sz w:val="28"/>
+      <w:sz w:val="26"/>
       <w:szCs w:val="26"/>
     </w:rPr>
   </w:style>

</xml_diff>

<commit_message>
Property research: 3516 Winding Shore Lane - updated with street view + map image
- Added composite image with street view (left) and map view (right) at top
- Added Google Maps and Apple Maps links in PDF
- Fixed PDF image display issue

Google Drive: https://drive.google.com/drive/folders/1yRRw2vG1pj5FPsVwgfS_S2YAqvpJkDuE
</commit_message>
<xml_diff>
--- a/3516_Winding_Shore_Lane_Property_Report.docx
+++ b/3516_Winding_Shore_Lane_Property_Report.docx
@@ -23,14 +23,14 @@
         <w:pStyle w:val="Heading3"/>
       </w:pPr>
       <w:r>
-        <w:t>Google Maps Location:</w:t>
+        <w:t>Property Location:</w:t>
       </w:r>
     </w:p>
     <w:p>
       <w:r>
         <w:drawing>
           <wp:inline xmlns:a="http://schemas.openxmlformats.org/drawingml/2006/main" xmlns:pic="http://schemas.openxmlformats.org/drawingml/2006/picture">
-            <wp:extent cx="5486400" cy="3657600"/>
+            <wp:extent cx="7315200" cy="3657600"/>
             <wp:docPr id="1" name="Picture 1"/>
             <wp:cNvGraphicFramePr>
               <a:graphicFrameLocks noChangeAspect="1"/>
@@ -39,7 +39,7 @@
               <a:graphicData uri="http://schemas.openxmlformats.org/drawingml/2006/picture">
                 <pic:pic>
                   <pic:nvPicPr>
-                    <pic:cNvPr id="0" name="3516_google_maps.jpg"/>
+                    <pic:cNvPr id="0" name="3516_property_location.jpg"/>
                     <pic:cNvPicPr/>
                   </pic:nvPicPr>
                   <pic:blipFill>
@@ -51,7 +51,7 @@
                   <pic:spPr>
                     <a:xfrm>
                       <a:off x="0" y="0"/>
-                      <a:ext cx="5486400" cy="3657600"/>
+                      <a:ext cx="7315200" cy="3657600"/>
                     </a:xfrm>
                     <a:prstGeom prst="rect"/>
                   </pic:spPr>
@@ -60,6 +60,17 @@
             </a:graphic>
           </wp:inline>
         </w:drawing>
+      </w:r>
+    </w:p>
+    <w:p/>
+    <w:p>
+      <w:r>
+        <w:t>Google Maps Link: https://www.google.com/maps/place/3516+Winding+Shore+Ln,+Pflugerville,+TX+78660</w:t>
+      </w:r>
+    </w:p>
+    <w:p>
+      <w:r>
+        <w:t>Apple Maps Link: https://maps.apple.com/?q=3516+Winding+Shore+Ln,+Pflugerville,+TX+78660</w:t>
       </w:r>
     </w:p>
     <w:p/>

</xml_diff>

<commit_message>
Property research: 3516 Winding Shore Lane - stacked images (street view on top, map on bottom)
- Changed composite image from side-by-side to stacked layout
- Street view (left image) now appears at top
- Map view (right image) now appears at bottom
- Updated both DOCX and PDF reports

Google Drive: https://drive.google.com/drive/folders/1yRRw2vG1pj5FPsVwgfS_S2YAqvpJkDuE
</commit_message>
<xml_diff>
--- a/3516_Winding_Shore_Lane_Property_Report.docx
+++ b/3516_Winding_Shore_Lane_Property_Report.docx
@@ -30,7 +30,7 @@
       <w:r>
         <w:drawing>
           <wp:inline xmlns:a="http://schemas.openxmlformats.org/drawingml/2006/main" xmlns:pic="http://schemas.openxmlformats.org/drawingml/2006/picture">
-            <wp:extent cx="7315200" cy="3657600"/>
+            <wp:extent cx="7315200" cy="9144000"/>
             <wp:docPr id="1" name="Picture 1"/>
             <wp:cNvGraphicFramePr>
               <a:graphicFrameLocks noChangeAspect="1"/>
@@ -51,7 +51,7 @@
                   <pic:spPr>
                     <a:xfrm>
                       <a:off x="0" y="0"/>
-                      <a:ext cx="7315200" cy="3657600"/>
+                      <a:ext cx="7315200" cy="9144000"/>
                     </a:xfrm>
                     <a:prstGeom prst="rect"/>
                   </pic:spPr>
@@ -60,17 +60,6 @@
             </a:graphic>
           </wp:inline>
         </w:drawing>
-      </w:r>
-    </w:p>
-    <w:p/>
-    <w:p>
-      <w:r>
-        <w:t>Google Maps Link: https://www.google.com/maps/place/3516+Winding+Shore+Ln,+Pflugerville,+TX+78660</w:t>
-      </w:r>
-    </w:p>
-    <w:p>
-      <w:r>
-        <w:t>Apple Maps Link: https://maps.apple.com/?q=3516+Winding+Shore+Ln,+Pflugerville,+TX+78660</w:t>
       </w:r>
     </w:p>
     <w:p/>

</xml_diff>

<commit_message>
Property research: 3516 Winding Shore Lane - images resized for letter page
- Images optimized for 8.5" x 11" letter page
- Composite: 800x1050 pixels, fits comfortably on page
- Both DOCX and PDF reports updated

Google Drive: https://drive.google.com/drive/folders/1yRRw2vG1pj5FPsVwgfS_S2YAqvpJkDuE
</commit_message>
<xml_diff>
--- a/3516_Winding_Shore_Lane_Property_Report.docx
+++ b/3516_Winding_Shore_Lane_Property_Report.docx
@@ -30,7 +30,7 @@
       <w:r>
         <w:drawing>
           <wp:inline xmlns:a="http://schemas.openxmlformats.org/drawingml/2006/main" xmlns:pic="http://schemas.openxmlformats.org/drawingml/2006/picture">
-            <wp:extent cx="7315200" cy="9144000"/>
+            <wp:extent cx="7315200" cy="7315200"/>
             <wp:docPr id="1" name="Picture 1"/>
             <wp:cNvGraphicFramePr>
               <a:graphicFrameLocks noChangeAspect="1"/>
@@ -51,7 +51,7 @@
                   <pic:spPr>
                     <a:xfrm>
                       <a:off x="0" y="0"/>
-                      <a:ext cx="7315200" cy="9144000"/>
+                      <a:ext cx="7315200" cy="7315200"/>
                     </a:xfrm>
                     <a:prstGeom prst="rect"/>
                   </pic:spPr>

</xml_diff>

<commit_message>
Property research: 3516 Winding Shore Lane - separate pages for street view and map
- Street view on first page
- Map view on second page with Google Maps and Apple Maps links
- Both DOCX and PDF reports updated

Google Drive: https://drive.google.com/drive/folders/1yRRw2vG1pj5FPsVwgfS_S2YAqvpJkDuE
</commit_message>
<xml_diff>
--- a/3516_Winding_Shore_Lane_Property_Report.docx
+++ b/3516_Winding_Shore_Lane_Property_Report.docx
@@ -18,12 +18,13 @@
         <w:t>3516 Winding Shore Lane, Pflugerville TX 78660</w:t>
       </w:r>
     </w:p>
+    <w:p/>
     <w:p>
       <w:pPr>
         <w:pStyle w:val="Heading3"/>
       </w:pPr>
       <w:r>
-        <w:t>Property Location:</w:t>
+        <w:t>Street View:</w:t>
       </w:r>
     </w:p>
     <w:p>
@@ -39,11 +40,61 @@
               <a:graphicData uri="http://schemas.openxmlformats.org/drawingml/2006/picture">
                 <pic:pic>
                   <pic:nvPicPr>
-                    <pic:cNvPr id="0" name="3516_property_location.jpg"/>
+                    <pic:cNvPr id="0" name="3516_street_view_page.jpg"/>
                     <pic:cNvPicPr/>
                   </pic:nvPicPr>
                   <pic:blipFill>
                     <a:blip r:embed="rId9"/>
+                    <a:stretch>
+                      <a:fillRect/>
+                    </a:stretch>
+                  </pic:blipFill>
+                  <pic:spPr>
+                    <a:xfrm>
+                      <a:off x="0" y="0"/>
+                      <a:ext cx="7315200" cy="7315200"/>
+                    </a:xfrm>
+                    <a:prstGeom prst="rect"/>
+                  </pic:spPr>
+                </pic:pic>
+              </a:graphicData>
+            </a:graphic>
+          </wp:inline>
+        </w:drawing>
+      </w:r>
+    </w:p>
+    <w:p/>
+    <w:p/>
+    <w:p>
+      <w:br w:type="page"/>
+      <w:r/>
+    </w:p>
+    <w:p>
+      <w:pPr>
+        <w:pStyle w:val="Heading3"/>
+      </w:pPr>
+      <w:r>
+        <w:t>Map View:</w:t>
+      </w:r>
+    </w:p>
+    <w:p>
+      <w:r>
+        <w:drawing>
+          <wp:inline xmlns:a="http://schemas.openxmlformats.org/drawingml/2006/main" xmlns:pic="http://schemas.openxmlformats.org/drawingml/2006/picture">
+            <wp:extent cx="7315200" cy="7315200"/>
+            <wp:docPr id="2" name="Picture 2"/>
+            <wp:cNvGraphicFramePr>
+              <a:graphicFrameLocks noChangeAspect="1"/>
+            </wp:cNvGraphicFramePr>
+            <a:graphic>
+              <a:graphicData uri="http://schemas.openxmlformats.org/drawingml/2006/picture">
+                <pic:pic>
+                  <pic:nvPicPr>
+                    <pic:cNvPr id="0" name="3516_map_page.jpg"/>
+                    <pic:cNvPicPr/>
+                  </pic:nvPicPr>
+                  <pic:blipFill>
+                    <a:blip r:embed="rId10"/>
                     <a:stretch>
                       <a:fillRect/>
                     </a:stretch>

</xml_diff>